<commit_message>
Changes to AWS deployment changing lookback days for drift check
</commit_message>
<xml_diff>
--- a/MSML605_Progress_Report_NEW.docx
+++ b/MSML605_Progress_Report_NEW.docx
@@ -296,7 +296,7 @@
           <w:szCs w:val="28"/>
           <w:u w:val="single"/>
         </w:rPr>
-        <w:t>Each Member’s Planned Contribution</w:t>
+        <w:t>Each Member’s Contribution</w:t>
       </w:r>
     </w:p>
     <w:p>
@@ -316,31 +316,7 @@
           <w:sz w:val="22"/>
           <w:szCs w:val="22"/>
         </w:rPr>
-        <w:t xml:space="preserve">Dhanvin </w:t>
-      </w:r>
-      <w:proofErr w:type="gramStart"/>
-      <w:r>
-        <w:rPr>
-          <w:rFonts w:ascii="Arial" w:hAnsi="Arial" w:cs="Arial"/>
-          <w:b/>
-          <w:bCs/>
-          <w:color w:val="000000"/>
-          <w:sz w:val="22"/>
-          <w:szCs w:val="22"/>
-        </w:rPr>
-        <w:t>S :</w:t>
-      </w:r>
-      <w:proofErr w:type="gramEnd"/>
-      <w:r>
-        <w:rPr>
-          <w:rFonts w:ascii="Arial" w:hAnsi="Arial" w:cs="Arial"/>
-          <w:b/>
-          <w:bCs/>
-          <w:color w:val="000000"/>
-          <w:sz w:val="22"/>
-          <w:szCs w:val="22"/>
-        </w:rPr>
-        <w:t xml:space="preserve"> Cloud &amp; Infrastructure Engineer</w:t>
+        <w:t>Dhanvin S : Cloud &amp; Infrastructure Engineer</w:t>
       </w:r>
     </w:p>
     <w:p>
@@ -416,27 +392,7 @@
           <w:sz w:val="22"/>
           <w:szCs w:val="22"/>
         </w:rPr>
-        <w:t xml:space="preserve"> </w:t>
-      </w:r>
-      <w:proofErr w:type="spellStart"/>
-      <w:r>
-        <w:rPr>
-          <w:rFonts w:ascii="Arial" w:hAnsi="Arial" w:cs="Arial"/>
-          <w:color w:val="000000"/>
-          <w:sz w:val="22"/>
-          <w:szCs w:val="22"/>
-        </w:rPr>
-        <w:t>Dockerize</w:t>
-      </w:r>
-      <w:proofErr w:type="spellEnd"/>
-      <w:r>
-        <w:rPr>
-          <w:rFonts w:ascii="Arial" w:hAnsi="Arial" w:cs="Arial"/>
-          <w:color w:val="000000"/>
-          <w:sz w:val="22"/>
-          <w:szCs w:val="22"/>
-        </w:rPr>
-        <w:t xml:space="preserve"> the inference engine and training services, ensuring they are optimized for cloud deployment.</w:t>
+        <w:t xml:space="preserve"> Dockerize the inference engine and training services, ensuring they are optimized for cloud deployment.</w:t>
       </w:r>
     </w:p>
     <w:p>
@@ -592,31 +548,7 @@
           <w:sz w:val="22"/>
           <w:szCs w:val="22"/>
         </w:rPr>
-        <w:t xml:space="preserve">Sarthak </w:t>
-      </w:r>
-      <w:proofErr w:type="gramStart"/>
-      <w:r>
-        <w:rPr>
-          <w:rFonts w:ascii="Arial" w:hAnsi="Arial" w:cs="Arial"/>
-          <w:b/>
-          <w:bCs/>
-          <w:color w:val="000000"/>
-          <w:sz w:val="22"/>
-          <w:szCs w:val="22"/>
-        </w:rPr>
-        <w:t>Garg :</w:t>
-      </w:r>
-      <w:proofErr w:type="gramEnd"/>
-      <w:r>
-        <w:rPr>
-          <w:rFonts w:ascii="Arial" w:hAnsi="Arial" w:cs="Arial"/>
-          <w:b/>
-          <w:bCs/>
-          <w:color w:val="000000"/>
-          <w:sz w:val="22"/>
-          <w:szCs w:val="22"/>
-        </w:rPr>
-        <w:t xml:space="preserve"> Machine Learning Lead</w:t>
+        <w:t>Sarthak Garg : Machine Learning Lead</w:t>
       </w:r>
     </w:p>
     <w:p>
@@ -694,7 +626,6 @@
         </w:rPr>
         <w:t xml:space="preserve"> Design, train, and hyperparameter-tune </w:t>
       </w:r>
-      <w:proofErr w:type="spellStart"/>
       <w:r>
         <w:rPr>
           <w:rFonts w:ascii="Arial" w:hAnsi="Arial" w:cs="Arial"/>
@@ -706,7 +637,6 @@
         </w:rPr>
         <w:t>XGBoost</w:t>
       </w:r>
-      <w:proofErr w:type="spellEnd"/>
       <w:r>
         <w:rPr>
           <w:rFonts w:ascii="Arial" w:hAnsi="Arial" w:cs="Arial"/>
@@ -830,55 +760,7 @@
           <w:sz w:val="22"/>
           <w:szCs w:val="22"/>
         </w:rPr>
-        <w:t xml:space="preserve">Basil </w:t>
-      </w:r>
-      <w:proofErr w:type="gramStart"/>
-      <w:r>
-        <w:rPr>
-          <w:rFonts w:ascii="Arial" w:hAnsi="Arial" w:cs="Arial"/>
-          <w:b/>
-          <w:bCs/>
-          <w:color w:val="000000"/>
-          <w:sz w:val="22"/>
-          <w:szCs w:val="22"/>
-        </w:rPr>
-        <w:t>Varghese :</w:t>
-      </w:r>
-      <w:proofErr w:type="gramEnd"/>
-      <w:r>
-        <w:rPr>
-          <w:rFonts w:ascii="Arial" w:hAnsi="Arial" w:cs="Arial"/>
-          <w:b/>
-          <w:bCs/>
-          <w:color w:val="000000"/>
-          <w:sz w:val="22"/>
-          <w:szCs w:val="22"/>
-        </w:rPr>
-        <w:t xml:space="preserve"> </w:t>
-      </w:r>
-      <w:proofErr w:type="spellStart"/>
-      <w:r>
-        <w:rPr>
-          <w:rFonts w:ascii="Arial" w:hAnsi="Arial" w:cs="Arial"/>
-          <w:b/>
-          <w:bCs/>
-          <w:color w:val="000000"/>
-          <w:sz w:val="22"/>
-          <w:szCs w:val="22"/>
-        </w:rPr>
-        <w:t>MLOps</w:t>
-      </w:r>
-      <w:proofErr w:type="spellEnd"/>
-      <w:r>
-        <w:rPr>
-          <w:rFonts w:ascii="Arial" w:hAnsi="Arial" w:cs="Arial"/>
-          <w:b/>
-          <w:bCs/>
-          <w:color w:val="000000"/>
-          <w:sz w:val="22"/>
-          <w:szCs w:val="22"/>
-        </w:rPr>
-        <w:t xml:space="preserve"> &amp; Systems Monitoring Lead</w:t>
+        <w:t>Basil Varghese : MLOps &amp; Systems Monitoring Lead</w:t>
       </w:r>
     </w:p>
     <w:p>
@@ -1034,7 +916,6 @@
         </w:rPr>
         <w:t xml:space="preserve"> Build a </w:t>
       </w:r>
-      <w:proofErr w:type="spellStart"/>
       <w:r>
         <w:rPr>
           <w:rFonts w:ascii="Arial" w:hAnsi="Arial" w:cs="Arial"/>
@@ -1044,19 +925,7 @@
           <w:sz w:val="22"/>
           <w:szCs w:val="22"/>
         </w:rPr>
-        <w:t>Streamlit</w:t>
-      </w:r>
-      <w:proofErr w:type="spellEnd"/>
-      <w:r>
-        <w:rPr>
-          <w:rFonts w:ascii="Arial" w:hAnsi="Arial" w:cs="Arial"/>
-          <w:b/>
-          <w:bCs/>
-          <w:color w:val="000000"/>
-          <w:sz w:val="22"/>
-          <w:szCs w:val="22"/>
-        </w:rPr>
-        <w:t>/Dash</w:t>
+        <w:t>Streamlit/Dash</w:t>
       </w:r>
       <w:r>
         <w:rPr>
@@ -1301,27 +1170,7 @@
           <w:sz w:val="22"/>
           <w:szCs w:val="22"/>
         </w:rPr>
-        <w:t xml:space="preserve"> Time-series forecasting models (such as LSTMs or </w:t>
-      </w:r>
-      <w:proofErr w:type="spellStart"/>
-      <w:r>
-        <w:rPr>
-          <w:rFonts w:ascii="Arial" w:hAnsi="Arial" w:cs="Arial"/>
-          <w:color w:val="000000"/>
-          <w:sz w:val="22"/>
-          <w:szCs w:val="22"/>
-        </w:rPr>
-        <w:t>XGBoost</w:t>
-      </w:r>
-      <w:proofErr w:type="spellEnd"/>
-      <w:r>
-        <w:rPr>
-          <w:rFonts w:ascii="Arial" w:hAnsi="Arial" w:cs="Arial"/>
-          <w:color w:val="000000"/>
-          <w:sz w:val="22"/>
-          <w:szCs w:val="22"/>
-        </w:rPr>
-        <w:t>) will be used to predict closing prices.</w:t>
+        <w:t xml:space="preserve"> Time-series forecasting models (such as LSTMs or XGBoost) will be used to predict closing prices.</w:t>
       </w:r>
     </w:p>
     <w:p>
@@ -1341,7 +1190,6 @@
           <w:szCs w:val="22"/>
         </w:rPr>
       </w:pPr>
-      <w:proofErr w:type="spellStart"/>
       <w:r>
         <w:rPr>
           <w:rFonts w:ascii="Arial" w:hAnsi="Arial" w:cs="Arial"/>
@@ -1351,19 +1199,7 @@
           <w:sz w:val="22"/>
           <w:szCs w:val="22"/>
         </w:rPr>
-        <w:t>MLOps</w:t>
-      </w:r>
-      <w:proofErr w:type="spellEnd"/>
-      <w:r>
-        <w:rPr>
-          <w:rFonts w:ascii="Arial" w:hAnsi="Arial" w:cs="Arial"/>
-          <w:b/>
-          <w:bCs/>
-          <w:color w:val="000000"/>
-          <w:sz w:val="22"/>
-          <w:szCs w:val="22"/>
-        </w:rPr>
-        <w:t xml:space="preserve"> &amp; Monitoring:</w:t>
+        <w:t>MLOps &amp; Monitoring:</w:t>
       </w:r>
       <w:r>
         <w:rPr>
@@ -1529,27 +1365,7 @@
           <w:sz w:val="22"/>
           <w:szCs w:val="22"/>
         </w:rPr>
-        <w:t xml:space="preserve">System-level quantitative evaluation of </w:t>
-      </w:r>
-      <w:proofErr w:type="spellStart"/>
-      <w:r>
-        <w:rPr>
-          <w:rFonts w:ascii="Arial" w:hAnsi="Arial" w:cs="Arial"/>
-          <w:color w:val="000000"/>
-          <w:sz w:val="22"/>
-          <w:szCs w:val="22"/>
-        </w:rPr>
-        <w:t>MLOps</w:t>
-      </w:r>
-      <w:proofErr w:type="spellEnd"/>
-      <w:r>
-        <w:rPr>
-          <w:rFonts w:ascii="Arial" w:hAnsi="Arial" w:cs="Arial"/>
-          <w:color w:val="000000"/>
-          <w:sz w:val="22"/>
-          <w:szCs w:val="22"/>
-        </w:rPr>
-        <w:t xml:space="preserve"> benefits</w:t>
+        <w:t>System-level quantitative evaluation of MLOps benefits</w:t>
       </w:r>
     </w:p>
     <w:p>
@@ -1787,16 +1603,7 @@
           <w:sz w:val="22"/>
           <w:szCs w:val="22"/>
         </w:rPr>
-        <w:t>Amazon</w:t>
-      </w:r>
-      <w:r>
-        <w:rPr>
-          <w:rFonts w:ascii="Arial" w:hAnsi="Arial" w:cs="Arial"/>
-          <w:color w:val="000000"/>
-          <w:sz w:val="22"/>
-          <w:szCs w:val="22"/>
-        </w:rPr>
-        <w:t xml:space="preserve"> </w:t>
+        <w:t xml:space="preserve">Amazon </w:t>
       </w:r>
       <w:r>
         <w:rPr>
@@ -1832,16 +1639,7 @@
           <w:sz w:val="22"/>
           <w:szCs w:val="22"/>
         </w:rPr>
-        <w:t>Amazon</w:t>
-      </w:r>
-      <w:r>
-        <w:rPr>
-          <w:rFonts w:ascii="Arial" w:hAnsi="Arial" w:cs="Arial"/>
-          <w:color w:val="000000"/>
-          <w:sz w:val="22"/>
-          <w:szCs w:val="22"/>
-        </w:rPr>
-        <w:t xml:space="preserve"> </w:t>
+        <w:t xml:space="preserve">Amazon </w:t>
       </w:r>
       <w:r>
         <w:rPr>
@@ -1886,16 +1684,7 @@
           <w:sz w:val="22"/>
           <w:szCs w:val="22"/>
         </w:rPr>
-        <w:t>Amazon</w:t>
-      </w:r>
-      <w:r>
-        <w:rPr>
-          <w:rFonts w:ascii="Arial" w:hAnsi="Arial" w:cs="Arial"/>
-          <w:color w:val="000000"/>
-          <w:sz w:val="22"/>
-          <w:szCs w:val="22"/>
-        </w:rPr>
-        <w:t xml:space="preserve"> EventBridge</w:t>
+        <w:t>Amazon EventBridge</w:t>
       </w:r>
     </w:p>
     <w:p>
@@ -2038,37 +1827,15 @@
           <w:szCs w:val="22"/>
         </w:rPr>
       </w:pPr>
-      <w:proofErr w:type="spellStart"/>
-      <w:r>
-        <w:rPr>
-          <w:rFonts w:ascii="Arial" w:hAnsi="Arial" w:cs="Arial"/>
-          <w:color w:val="000000"/>
-          <w:sz w:val="22"/>
-          <w:szCs w:val="22"/>
-        </w:rPr>
-        <w:t>XGBoost</w:t>
-      </w:r>
-      <w:proofErr w:type="spellEnd"/>
-      <w:r>
-        <w:rPr>
-          <w:rFonts w:ascii="Arial" w:hAnsi="Arial" w:cs="Arial"/>
-          <w:color w:val="000000"/>
-          <w:sz w:val="22"/>
-          <w:szCs w:val="22"/>
-        </w:rPr>
-        <w:t xml:space="preserve"> or </w:t>
-      </w:r>
-      <w:proofErr w:type="spellStart"/>
-      <w:r>
-        <w:rPr>
-          <w:rFonts w:ascii="Arial" w:hAnsi="Arial" w:cs="Arial"/>
-          <w:color w:val="000000"/>
-          <w:sz w:val="22"/>
-          <w:szCs w:val="22"/>
-        </w:rPr>
-        <w:t>PyTorch</w:t>
-      </w:r>
-      <w:proofErr w:type="spellEnd"/>
+      <w:r>
+        <w:rPr>
+          <w:rFonts w:ascii="Arial" w:hAnsi="Arial" w:cs="Arial"/>
+          <w:color w:val="000000"/>
+          <w:sz w:val="22"/>
+          <w:szCs w:val="22"/>
+        </w:rPr>
+        <w:t>XGBoost or PyTorch</w:t>
+      </w:r>
     </w:p>
     <w:p>
       <w:pPr>
@@ -2298,56 +2065,16 @@
           <w:sz w:val="22"/>
           <w:szCs w:val="22"/>
         </w:rPr>
-        <w:t xml:space="preserve">Starting from raw market data, the system cleans and transforms it into 23 technical indicators, trains an </w:t>
-      </w:r>
-      <w:proofErr w:type="spellStart"/>
-      <w:r>
-        <w:rPr>
-          <w:rFonts w:ascii="Arial" w:hAnsi="Arial" w:cs="Arial"/>
-          <w:color w:val="000000"/>
-          <w:sz w:val="22"/>
-          <w:szCs w:val="22"/>
-        </w:rPr>
-        <w:t>XGBoost</w:t>
-      </w:r>
-      <w:proofErr w:type="spellEnd"/>
-      <w:r>
-        <w:rPr>
-          <w:rFonts w:ascii="Arial" w:hAnsi="Arial" w:cs="Arial"/>
-          <w:color w:val="000000"/>
-          <w:sz w:val="22"/>
-          <w:szCs w:val="22"/>
-        </w:rPr>
-        <w:t xml:space="preserve"> model, and exposes predictions through</w:t>
-      </w:r>
-      <w:r>
-        <w:rPr>
-          <w:rFonts w:ascii="Arial" w:hAnsi="Arial" w:cs="Arial"/>
-          <w:color w:val="000000"/>
-          <w:sz w:val="22"/>
-          <w:szCs w:val="22"/>
-        </w:rPr>
-        <w:t xml:space="preserve"> </w:t>
-      </w:r>
-      <w:proofErr w:type="spellStart"/>
-      <w:r>
-        <w:rPr>
-          <w:rFonts w:ascii="Arial" w:hAnsi="Arial" w:cs="Arial"/>
-          <w:color w:val="000000"/>
-          <w:sz w:val="22"/>
-          <w:szCs w:val="22"/>
-        </w:rPr>
-        <w:t>Sagemaker</w:t>
-      </w:r>
-      <w:proofErr w:type="spellEnd"/>
-      <w:r>
-        <w:rPr>
-          <w:rFonts w:ascii="Arial" w:hAnsi="Arial" w:cs="Arial"/>
-          <w:color w:val="000000"/>
-          <w:sz w:val="22"/>
-          <w:szCs w:val="22"/>
-        </w:rPr>
-        <w:t xml:space="preserve"> inference endpoint</w:t>
+        <w:t>Starting from raw market data, the system cleans and transforms it into 23 technical indicators, trains an XGBoost model, and exposes predictions through</w:t>
+      </w:r>
+      <w:r>
+        <w:rPr>
+          <w:rFonts w:ascii="Arial" w:hAnsi="Arial" w:cs="Arial"/>
+          <w:color w:val="000000"/>
+          <w:sz w:val="22"/>
+          <w:szCs w:val="22"/>
+        </w:rPr>
+        <w:t xml:space="preserve"> Sagemaker inference endpoint</w:t>
       </w:r>
       <w:r>
         <w:rPr>
@@ -2382,12 +2109,6 @@
         <w:gridCol w:w="1600"/>
       </w:tblGrid>
       <w:tr>
-        <w:tblPrEx>
-          <w:tblCellMar>
-            <w:top w:w="0" w:type="dxa"/>
-            <w:bottom w:w="0" w:type="dxa"/>
-          </w:tblCellMar>
-        </w:tblPrEx>
         <w:trPr>
           <w:tblHeader/>
         </w:trPr>
@@ -2483,12 +2204,6 @@
         </w:tc>
       </w:tr>
       <w:tr>
-        <w:tblPrEx>
-          <w:tblCellMar>
-            <w:top w:w="0" w:type="dxa"/>
-            <w:bottom w:w="0" w:type="dxa"/>
-          </w:tblCellMar>
-        </w:tblPrEx>
         <w:tc>
           <w:tcPr>
             <w:tcW w:w="2200" w:type="dxa"/>
@@ -2559,15 +2274,7 @@
                 <w:sz w:val="19"/>
                 <w:szCs w:val="19"/>
               </w:rPr>
-              <w:t>Defeat Beta API</w:t>
-            </w:r>
-            <w:r>
-              <w:rPr>
-                <w:color w:val="2C2C2C"/>
-                <w:sz w:val="19"/>
-                <w:szCs w:val="19"/>
-              </w:rPr>
-              <w:t xml:space="preserve"> </w:t>
+              <w:t xml:space="preserve">Defeat Beta API </w:t>
             </w:r>
             <w:r>
               <w:rPr>
@@ -2638,12 +2345,6 @@
         </w:tc>
       </w:tr>
       <w:tr>
-        <w:tblPrEx>
-          <w:tblCellMar>
-            <w:top w:w="0" w:type="dxa"/>
-            <w:bottom w:w="0" w:type="dxa"/>
-          </w:tblCellMar>
-        </w:tblPrEx>
         <w:tc>
           <w:tcPr>
             <w:tcW w:w="2200" w:type="dxa"/>
@@ -2737,12 +2438,6 @@
         </w:tc>
       </w:tr>
       <w:tr>
-        <w:tblPrEx>
-          <w:tblCellMar>
-            <w:top w:w="0" w:type="dxa"/>
-            <w:bottom w:w="0" w:type="dxa"/>
-          </w:tblCellMar>
-        </w:tblPrEx>
         <w:tc>
           <w:tcPr>
             <w:tcW w:w="2200" w:type="dxa"/>
@@ -2791,23 +2486,13 @@
             </w:tcMar>
           </w:tcPr>
           <w:p>
-            <w:proofErr w:type="spellStart"/>
             <w:r>
               <w:rPr>
                 <w:color w:val="2C2C2C"/>
                 <w:sz w:val="19"/>
                 <w:szCs w:val="19"/>
               </w:rPr>
-              <w:t>XGBoost</w:t>
-            </w:r>
-            <w:proofErr w:type="spellEnd"/>
-            <w:r>
-              <w:rPr>
-                <w:color w:val="2C2C2C"/>
-                <w:sz w:val="19"/>
-                <w:szCs w:val="19"/>
-              </w:rPr>
-              <w:t xml:space="preserve"> with walk-forward cross-validation to prevent look-ahead leakage; quantile outputs for prediction intervals</w:t>
+              <w:t>XGBoost with walk-forward cross-validation to prevent look-ahead leakage; quantile outputs for prediction intervals</w:t>
             </w:r>
           </w:p>
         </w:tc>
@@ -2846,12 +2531,6 @@
         </w:tc>
       </w:tr>
       <w:tr>
-        <w:tblPrEx>
-          <w:tblCellMar>
-            <w:top w:w="0" w:type="dxa"/>
-            <w:bottom w:w="0" w:type="dxa"/>
-          </w:tblCellMar>
-        </w:tblPrEx>
         <w:tc>
           <w:tcPr>
             <w:tcW w:w="2200" w:type="dxa"/>
@@ -2900,31 +2579,13 @@
             </w:tcMar>
           </w:tcPr>
           <w:p>
-            <w:proofErr w:type="spellStart"/>
             <w:r>
               <w:rPr>
                 <w:color w:val="2C2C2C"/>
                 <w:sz w:val="19"/>
                 <w:szCs w:val="19"/>
               </w:rPr>
-              <w:t>Sagemaker</w:t>
-            </w:r>
-            <w:proofErr w:type="spellEnd"/>
-            <w:r>
-              <w:rPr>
-                <w:color w:val="2C2C2C"/>
-                <w:sz w:val="19"/>
-                <w:szCs w:val="19"/>
-              </w:rPr>
-              <w:t xml:space="preserve"> inference</w:t>
-            </w:r>
-            <w:r>
-              <w:rPr>
-                <w:color w:val="2C2C2C"/>
-                <w:sz w:val="19"/>
-                <w:szCs w:val="19"/>
-              </w:rPr>
-              <w:t xml:space="preserve"> endpoint serving predictions with low/mid/high confidence bounds</w:t>
+              <w:t>Sagemaker inference endpoint serving predictions with low/mid/high confidence bounds</w:t>
             </w:r>
           </w:p>
         </w:tc>
@@ -2963,12 +2624,6 @@
         </w:tc>
       </w:tr>
       <w:tr>
-        <w:tblPrEx>
-          <w:tblCellMar>
-            <w:top w:w="0" w:type="dxa"/>
-            <w:bottom w:w="0" w:type="dxa"/>
-          </w:tblCellMar>
-        </w:tblPrEx>
         <w:tc>
           <w:tcPr>
             <w:tcW w:w="2200" w:type="dxa"/>
@@ -3078,12 +2733,6 @@
         </w:tc>
       </w:tr>
       <w:tr>
-        <w:tblPrEx>
-          <w:tblCellMar>
-            <w:top w:w="0" w:type="dxa"/>
-            <w:bottom w:w="0" w:type="dxa"/>
-          </w:tblCellMar>
-        </w:tblPrEx>
         <w:tc>
           <w:tcPr>
             <w:tcW w:w="2200" w:type="dxa"/>
@@ -3177,12 +2826,6 @@
         </w:tc>
       </w:tr>
       <w:tr>
-        <w:tblPrEx>
-          <w:tblCellMar>
-            <w:top w:w="0" w:type="dxa"/>
-            <w:bottom w:w="0" w:type="dxa"/>
-          </w:tblCellMar>
-        </w:tblPrEx>
         <w:tc>
           <w:tcPr>
             <w:tcW w:w="2200" w:type="dxa"/>
@@ -3231,23 +2874,13 @@
             </w:tcMar>
           </w:tcPr>
           <w:p>
-            <w:proofErr w:type="spellStart"/>
             <w:r>
               <w:rPr>
                 <w:color w:val="2C2C2C"/>
                 <w:sz w:val="19"/>
                 <w:szCs w:val="19"/>
               </w:rPr>
-              <w:t>Streamlit</w:t>
-            </w:r>
-            <w:proofErr w:type="spellEnd"/>
-            <w:r>
-              <w:rPr>
-                <w:color w:val="2C2C2C"/>
-                <w:sz w:val="19"/>
-                <w:szCs w:val="19"/>
-              </w:rPr>
-              <w:t xml:space="preserve"> app with three tabs: live predictions, drift metrics, and system health</w:t>
+              <w:t>Streamlit app with three tabs: live predictions, drift metrics, and system health</w:t>
             </w:r>
           </w:p>
         </w:tc>
@@ -3286,12 +2919,6 @@
         </w:tc>
       </w:tr>
       <w:tr>
-        <w:tblPrEx>
-          <w:tblCellMar>
-            <w:top w:w="0" w:type="dxa"/>
-            <w:bottom w:w="0" w:type="dxa"/>
-          </w:tblCellMar>
-        </w:tblPrEx>
         <w:tc>
           <w:tcPr>
             <w:tcW w:w="2200" w:type="dxa"/>
@@ -3310,7 +2937,6 @@
             </w:tcMar>
           </w:tcPr>
           <w:p>
-            <w:proofErr w:type="spellStart"/>
             <w:r>
               <w:rPr>
                 <w:b/>
@@ -3321,7 +2947,6 @@
               </w:rPr>
               <w:t>Containerisation</w:t>
             </w:r>
-            <w:proofErr w:type="spellEnd"/>
           </w:p>
         </w:tc>
         <w:tc>
@@ -3395,12 +3020,6 @@
         </w:tc>
       </w:tr>
       <w:tr>
-        <w:tblPrEx>
-          <w:tblCellMar>
-            <w:top w:w="0" w:type="dxa"/>
-            <w:bottom w:w="0" w:type="dxa"/>
-          </w:tblCellMar>
-        </w:tblPrEx>
         <w:tc>
           <w:tcPr>
             <w:tcW w:w="2200" w:type="dxa"/>
@@ -3494,12 +3113,6 @@
         </w:tc>
       </w:tr>
       <w:tr>
-        <w:tblPrEx>
-          <w:tblCellMar>
-            <w:top w:w="0" w:type="dxa"/>
-            <w:bottom w:w="0" w:type="dxa"/>
-          </w:tblCellMar>
-        </w:tblPrEx>
         <w:tc>
           <w:tcPr>
             <w:tcW w:w="2200" w:type="dxa"/>
@@ -3773,28 +3386,8 @@
                                 <w:sz w:val="13"/>
                                 <w:szCs w:val="13"/>
                               </w:rPr>
-                              <w:t xml:space="preserve">            • Computes PSI + KS test vs </w:t>
+                              <w:t xml:space="preserve">            • Computes PSI + KS test vs baseline_stats.json</w:t>
                             </w:r>
-                            <w:proofErr w:type="spellStart"/>
-                            <w:r>
-                              <w:rPr>
-                                <w:color w:val="000000" w:themeColor="text1"/>
-                                <w:sz w:val="13"/>
-                                <w:szCs w:val="13"/>
-                              </w:rPr>
-                              <w:t>baseline_</w:t>
-                            </w:r>
-                            <w:proofErr w:type="gramStart"/>
-                            <w:r>
-                              <w:rPr>
-                                <w:color w:val="000000" w:themeColor="text1"/>
-                                <w:sz w:val="13"/>
-                                <w:szCs w:val="13"/>
-                              </w:rPr>
-                              <w:t>stats.json</w:t>
-                            </w:r>
-                            <w:proofErr w:type="spellEnd"/>
-                            <w:proofErr w:type="gramEnd"/>
                           </w:p>
                           <w:p>
                             <w:pPr>
@@ -3811,18 +3404,8 @@
                                 <w:sz w:val="13"/>
                                 <w:szCs w:val="13"/>
                               </w:rPr>
-                              <w:t xml:space="preserve">            • Writes s3://.../monitoring/</w:t>
+                              <w:t xml:space="preserve">            • Writes s3://.../monitoring/latest_drift_report.json</w:t>
                             </w:r>
-                            <w:proofErr w:type="spellStart"/>
-                            <w:r>
-                              <w:rPr>
-                                <w:color w:val="000000" w:themeColor="text1"/>
-                                <w:sz w:val="13"/>
-                                <w:szCs w:val="13"/>
-                              </w:rPr>
-                              <w:t>latest_drift_report.json</w:t>
-                            </w:r>
-                            <w:proofErr w:type="spellEnd"/>
                           </w:p>
                           <w:p>
                             <w:pPr>
@@ -3839,25 +3422,7 @@
                                 <w:sz w:val="13"/>
                                 <w:szCs w:val="13"/>
                               </w:rPr>
-                              <w:t xml:space="preserve">            • Pushes </w:t>
-                            </w:r>
-                            <w:proofErr w:type="spellStart"/>
-                            <w:r>
-                              <w:rPr>
-                                <w:color w:val="000000" w:themeColor="text1"/>
-                                <w:sz w:val="13"/>
-                                <w:szCs w:val="13"/>
-                              </w:rPr>
-                              <w:t>Max_PSI</w:t>
-                            </w:r>
-                            <w:proofErr w:type="spellEnd"/>
-                            <w:r>
-                              <w:rPr>
-                                <w:color w:val="000000" w:themeColor="text1"/>
-                                <w:sz w:val="13"/>
-                                <w:szCs w:val="13"/>
-                              </w:rPr>
-                              <w:t xml:space="preserve"> to CloudWatch</w:t>
+                              <w:t xml:space="preserve">            • Pushes Max_PSI to CloudWatch</w:t>
                             </w:r>
                           </w:p>
                           <w:p>
@@ -3903,25 +3468,7 @@
                                 <w:sz w:val="13"/>
                                 <w:szCs w:val="13"/>
                               </w:rPr>
-                              <w:t xml:space="preserve">  └─ EventBridge → Lambda {source: </w:t>
-                            </w:r>
-                            <w:proofErr w:type="spellStart"/>
-                            <w:r>
-                              <w:rPr>
-                                <w:color w:val="000000" w:themeColor="text1"/>
-                                <w:sz w:val="13"/>
-                                <w:szCs w:val="13"/>
-                              </w:rPr>
-                              <w:t>drift_check_complete</w:t>
-                            </w:r>
-                            <w:proofErr w:type="spellEnd"/>
-                            <w:r>
-                              <w:rPr>
-                                <w:color w:val="000000" w:themeColor="text1"/>
-                                <w:sz w:val="13"/>
-                                <w:szCs w:val="13"/>
-                              </w:rPr>
-                              <w:t>}</w:t>
+                              <w:t xml:space="preserve">  └─ EventBridge → Lambda {source: drift_check_complete}</w:t>
                             </w:r>
                           </w:p>
                           <w:p>
@@ -3939,28 +3486,8 @@
                                 <w:sz w:val="13"/>
                                 <w:szCs w:val="13"/>
                               </w:rPr>
-                              <w:t xml:space="preserve">       • Reads </w:t>
+                              <w:t xml:space="preserve">       • Reads latest_drift_report.json</w:t>
                             </w:r>
-                            <w:proofErr w:type="spellStart"/>
-                            <w:r>
-                              <w:rPr>
-                                <w:color w:val="000000" w:themeColor="text1"/>
-                                <w:sz w:val="13"/>
-                                <w:szCs w:val="13"/>
-                              </w:rPr>
-                              <w:t>latest_drift_</w:t>
-                            </w:r>
-                            <w:proofErr w:type="gramStart"/>
-                            <w:r>
-                              <w:rPr>
-                                <w:color w:val="000000" w:themeColor="text1"/>
-                                <w:sz w:val="13"/>
-                                <w:szCs w:val="13"/>
-                              </w:rPr>
-                              <w:t>report.json</w:t>
-                            </w:r>
-                            <w:proofErr w:type="spellEnd"/>
-                            <w:proofErr w:type="gramEnd"/>
                           </w:p>
                           <w:p>
                             <w:pPr>
@@ -3977,43 +3504,7 @@
                                 <w:sz w:val="13"/>
                                 <w:szCs w:val="13"/>
                               </w:rPr>
-                              <w:t xml:space="preserve">       IF </w:t>
-                            </w:r>
-                            <w:proofErr w:type="spellStart"/>
-                            <w:r>
-                              <w:rPr>
-                                <w:color w:val="000000" w:themeColor="text1"/>
-                                <w:sz w:val="13"/>
-                                <w:szCs w:val="13"/>
-                              </w:rPr>
-                              <w:t>trigger_retraining</w:t>
-                            </w:r>
-                            <w:proofErr w:type="spellEnd"/>
-                            <w:r>
-                              <w:rPr>
-                                <w:color w:val="000000" w:themeColor="text1"/>
-                                <w:sz w:val="13"/>
-                                <w:szCs w:val="13"/>
-                              </w:rPr>
-                              <w:t xml:space="preserve"> = true (</w:t>
-                            </w:r>
-                            <w:proofErr w:type="spellStart"/>
-                            <w:r>
-                              <w:rPr>
-                                <w:color w:val="000000" w:themeColor="text1"/>
-                                <w:sz w:val="13"/>
-                                <w:szCs w:val="13"/>
-                              </w:rPr>
-                              <w:t>max_PSI</w:t>
-                            </w:r>
-                            <w:proofErr w:type="spellEnd"/>
-                            <w:r>
-                              <w:rPr>
-                                <w:color w:val="000000" w:themeColor="text1"/>
-                                <w:sz w:val="13"/>
-                                <w:szCs w:val="13"/>
-                              </w:rPr>
-                              <w:t xml:space="preserve"> &gt; 0.2 OR &gt; 30% features drifted):</w:t>
+                              <w:t xml:space="preserve">       IF trigger_retraining = true (max_PSI &gt; 0.2 OR &gt; 30% features drifted):</w:t>
                             </w:r>
                           </w:p>
                           <w:p>
@@ -4049,18 +3540,8 @@
                                 <w:sz w:val="13"/>
                                 <w:szCs w:val="13"/>
                               </w:rPr>
-                              <w:t xml:space="preserve">              • Fetches fresh OHLCV data via </w:t>
+                              <w:t xml:space="preserve">              • Fetches fresh OHLCV data via defeatbeta-api</w:t>
                             </w:r>
-                            <w:proofErr w:type="spellStart"/>
-                            <w:r>
-                              <w:rPr>
-                                <w:color w:val="000000" w:themeColor="text1"/>
-                                <w:sz w:val="13"/>
-                                <w:szCs w:val="13"/>
-                              </w:rPr>
-                              <w:t>defeatbeta-api</w:t>
-                            </w:r>
-                            <w:proofErr w:type="spellEnd"/>
                           </w:p>
                           <w:p>
                             <w:pPr>
@@ -4123,25 +3604,7 @@
                                 <w:sz w:val="13"/>
                                 <w:szCs w:val="13"/>
                               </w:rPr>
-                              <w:t xml:space="preserve">  └─ EventBridge → Lambda {source: </w:t>
-                            </w:r>
-                            <w:proofErr w:type="spellStart"/>
-                            <w:r>
-                              <w:rPr>
-                                <w:color w:val="000000" w:themeColor="text1"/>
-                                <w:sz w:val="13"/>
-                                <w:szCs w:val="13"/>
-                              </w:rPr>
-                              <w:t>ingestion_complete</w:t>
-                            </w:r>
-                            <w:proofErr w:type="spellEnd"/>
-                            <w:r>
-                              <w:rPr>
-                                <w:color w:val="000000" w:themeColor="text1"/>
-                                <w:sz w:val="13"/>
-                                <w:szCs w:val="13"/>
-                              </w:rPr>
-                              <w:t>}</w:t>
+                              <w:t xml:space="preserve">  └─ EventBridge → Lambda {source: ingestion_complete}</w:t>
                             </w:r>
                           </w:p>
                           <w:p>
@@ -4177,25 +3640,7 @@
                                 <w:sz w:val="13"/>
                                 <w:szCs w:val="13"/>
                               </w:rPr>
-                              <w:t xml:space="preserve">            • Trains new p50/p10/p90 </w:t>
-                            </w:r>
-                            <w:proofErr w:type="spellStart"/>
-                            <w:r>
-                              <w:rPr>
-                                <w:color w:val="000000" w:themeColor="text1"/>
-                                <w:sz w:val="13"/>
-                                <w:szCs w:val="13"/>
-                              </w:rPr>
-                              <w:t>XGBoost</w:t>
-                            </w:r>
-                            <w:proofErr w:type="spellEnd"/>
-                            <w:r>
-                              <w:rPr>
-                                <w:color w:val="000000" w:themeColor="text1"/>
-                                <w:sz w:val="13"/>
-                                <w:szCs w:val="13"/>
-                              </w:rPr>
-                              <w:t xml:space="preserve"> models</w:t>
+                              <w:t xml:space="preserve">            • Trains new p50/p10/p90 XGBoost models</w:t>
                             </w:r>
                           </w:p>
                           <w:p>
@@ -4213,28 +3658,8 @@
                                 <w:sz w:val="13"/>
                                 <w:szCs w:val="13"/>
                               </w:rPr>
-                              <w:t xml:space="preserve">            • Saves new </w:t>
+                              <w:t xml:space="preserve">            • Saves new baseline_stats.json</w:t>
                             </w:r>
-                            <w:proofErr w:type="spellStart"/>
-                            <w:r>
-                              <w:rPr>
-                                <w:color w:val="000000" w:themeColor="text1"/>
-                                <w:sz w:val="13"/>
-                                <w:szCs w:val="13"/>
-                              </w:rPr>
-                              <w:t>baseline_</w:t>
-                            </w:r>
-                            <w:proofErr w:type="gramStart"/>
-                            <w:r>
-                              <w:rPr>
-                                <w:color w:val="000000" w:themeColor="text1"/>
-                                <w:sz w:val="13"/>
-                                <w:szCs w:val="13"/>
-                              </w:rPr>
-                              <w:t>stats.json</w:t>
-                            </w:r>
-                            <w:proofErr w:type="spellEnd"/>
-                            <w:proofErr w:type="gramEnd"/>
                           </w:p>
                           <w:p>
                             <w:pPr>
@@ -4297,25 +3722,7 @@
                                 <w:sz w:val="13"/>
                                 <w:szCs w:val="13"/>
                               </w:rPr>
-                              <w:t xml:space="preserve">  └─ EventBridge → Lambda {source: </w:t>
-                            </w:r>
-                            <w:proofErr w:type="spellStart"/>
-                            <w:r>
-                              <w:rPr>
-                                <w:color w:val="000000" w:themeColor="text1"/>
-                                <w:sz w:val="13"/>
-                                <w:szCs w:val="13"/>
-                              </w:rPr>
-                              <w:t>training_complete</w:t>
-                            </w:r>
-                            <w:proofErr w:type="spellEnd"/>
-                            <w:r>
-                              <w:rPr>
-                                <w:color w:val="000000" w:themeColor="text1"/>
-                                <w:sz w:val="13"/>
-                                <w:szCs w:val="13"/>
-                              </w:rPr>
-                              <w:t>}</w:t>
+                              <w:t xml:space="preserve">  └─ EventBridge → Lambda {source: training_complete}</w:t>
                             </w:r>
                           </w:p>
                           <w:p>
@@ -5232,6 +4639,7 @@
       </w:pPr>
       <w:r>
         <w:rPr>
+          <w:noProof/>
           <w:sz w:val="28"/>
           <w:szCs w:val="28"/>
         </w:rPr>
@@ -5282,6 +4690,7 @@
       </w:pPr>
       <w:r>
         <w:rPr>
+          <w:noProof/>
           <w:sz w:val="28"/>
           <w:szCs w:val="28"/>
         </w:rPr>
@@ -5332,6 +4741,7 @@
       </w:pPr>
       <w:r>
         <w:rPr>
+          <w:noProof/>
           <w:sz w:val="28"/>
           <w:szCs w:val="28"/>
         </w:rPr>

</xml_diff>